<commit_message>
court(michctapp): motion brief regenerated on the current model, the conclusion kept with the signature; still reported (fb-595.54.63)
keep_with_closing settles the tier-2 page of the signature alone (p16). latex 10/0, XENG-001/002 PASS, XENG-003
579/586 ("cash/surety": typst and LibreOffice break after the slash, LaTeX does not); docx 10/0, pages differ from
p12 (LibreOffice keeps a note's anchor line and moves the note). cross_engine: report.

Co-Authored-By: Claude Opus 5.5 <noreply@anthropic.com>
</commit_message>
<xml_diff>
--- a/courts/sixth-circuit/michigan/state/court-of-appeals/motion-brief/usage/OUTPUT-motion-brief.docx
+++ b/courts/sixth-circuit/michigan/state/court-of-appeals/motion-brief/usage/OUTPUT-motion-brief.docx
@@ -1876,7 +1876,7 @@
         <w:tab/>
       </w:r>
       <w:r>
-        <w:t xml:space="preserve">15</w:t>
+        <w:t xml:space="preserve">16</w:t>
       </w:r>
     </w:p>
     <w:p>
@@ -9092,7 +9092,7 @@
         <w:pStyle w:val="BodyText"/>
       </w:pPr>
       <w:r>
-        <w:t xml:space="preserve">The Michigan Supreme Court has promulgated court rules establishing a double presumption that a pre-trial arrestee must be released without any cash bail requirement. First, “the court must order the pretrial release of the defendant on personal recognizance, or on an unsecured appearance bond . . . unless the court determines that such release will not reasonably ensure the appearance of the defendant as required, or that such release will present a danger to the public.” MCR 6.106(C)</w:t>
+        <w:t xml:space="preserve">The Michigan Supreme Court has promulgated court rules establishing a double presumption that a pre-trial arrestee must be released without any cash bail requirement. First, “the court must order the pretrial release of the defendant on personal recognizance, or on an unsecured appearance bond . . . unless the court determines that such release will not reasonably ensure the appearance of the defendant as required, or that such release will present a danger to the public.” MCR 6.106(C)</w:t>
       </w:r>
       <w:r>
         <w:t xml:space="preserve"> </w:t>
@@ -9112,7 +9112,7 @@
         <w:t xml:space="preserve"> </w:t>
       </w:r>
       <w:r>
-        <w:t xml:space="preserve">It is only “[i]f the court determines for reasons it states on the record that the defendant’s appearance or the protection of the public cannot otherwise be assured [that] money bail, with or without conditions . . . may be required.” MCR 6.106(E)</w:t>
+        <w:t xml:space="preserve">It is only “[i]f the court determines for reasons it states on the record that the defendant’s appearance or the protection of the public cannot otherwise be assured [that] money bail, with or without conditions . . . may be required.” MCR 6.106(E)</w:t>
       </w:r>
       <w:r>
         <w:t xml:space="preserve"> </w:t>
@@ -9755,13 +9755,13 @@
         <w:noBreakHyphen/>
       </w:r>
       <w:r>
-        <w:t xml:space="preserve">2535, 2018 WL 1053548, at *6 (WD Tenn, 2018) (“[R]equiring money bail as a condition of release at an amount impossible for the defendant to pay is equivalent to a detention order . . . .”). Yet MCR 6.106(F)⁠(3)</w:t>
-      </w:r>
-      <w:r>
-        <w:t xml:space="preserve"> </w:t>
-      </w:r>
-      <w:r>
-        <w:t xml:space="preserve">specifically prohibits “pretrial detention . . . on the basis of . . . economic status.”</w:t>
+        <w:t xml:space="preserve">2535, 2018 WL 1053548, at *6 (WD Tenn, 2018) (“[R]equiring money bail as a condition of release at an amount impossible for the defendant to pay is equivalent to a detention order . . . .”). Yet MCR 6.106(F)⁠(3)</w:t>
+      </w:r>
+      <w:r>
+        <w:t xml:space="preserve"> </w:t>
+      </w:r>
+      <w:r>
+        <w:t xml:space="preserve">specifically prohibits “pretrial detention . . . on the basis of . . . economic status.”</w:t>
       </w:r>
     </w:p>
     <w:p>
@@ -9769,7 +9769,7 @@
         <w:pStyle w:val="BodyText"/>
       </w:pPr>
       <w:r>
-        <w:t xml:space="preserve">That is precisely what a court does when it imposes bail that is unaffordable to a poor defendant without factoring in what the defendant can afford. Here, if Mr. Forbes could afford to pay $75,000 cash, he would be free while pending trial; but since he cannot he is instead detained “on the basis of . . . his economic status.”</w:t>
+        <w:t xml:space="preserve">That is precisely what a court does when it imposes bail that is unaffordable to a poor defendant without factoring in what the defendant can afford. Here, if Mr. Forbes could afford to pay $75,000 cash, he would be free while pending trial; but since he cannot he is instead detained “on the basis of . . . his economic status.”</w:t>
       </w:r>
       <w:r>
         <w:t xml:space="preserve"> </w:t>
@@ -11298,7 +11298,7 @@
     </w:p>
     <w:p>
       <w:pPr>
-        <w:pStyle w:val="BodyText"/>
+        <w:pStyle w:val="BodyTextKeep"/>
       </w:pPr>
       <w:r>
         <w:t xml:space="preserve">For the reasons stated, the circuit court’s bail order should be reversed and Mr. Forbes should be ordered released with a personal bond and the same non-financial release conditions that previously governed his yearlong release. Alternatively, his initial bond of $5,000 cash/​surety should be reinstated. Additionally, his case should be re-assigned to another judge in light of the circuit court’s demonstration of prejudice towards his exercise of his constitutional rights.</w:t>
@@ -11306,6 +11306,8 @@
     </w:p>
     <w:p>
       <w:pPr>
+        <w:keepNext/>
+        <w:keepLines/>
         <w:spacing w:before="0" w:after="0" w:line="432" w:lineRule="exact"/>
       </w:pPr>
     </w:p>
@@ -11830,7 +11832,7 @@
         <w:t xml:space="preserve"> </w:t>
       </w:r>
       <w:r>
-        <w:t xml:space="preserve">of Justice: How the Inability to Pay Bail Affects Case Outcomes, 34 J L Econ &amp; Org 511, 512, 532 (2018), available at https://​​academic.​oup.​com/​​jleo/​​article/​​34/​​4/​​511/​​5100740 (finding that a person who is detained pretrial has a 13 percent increase in the likelihood of being convicted and an 18 percent increase in the likelihood of pleading guilty); Leslie</w:t>
+        <w:t xml:space="preserve">of Justice: How the Inability to Pay Bail Affects Case Outcomes, 34 J L Econ &amp; Org 511, 512, 532 (2018), available at https://​academic.​oup.​com/​jleo/​article/​34/​4/​511/​5100740 (finding that a person who is detained pretrial has a 13 percent increase in the likelihood of being convicted and an 18 percent increase in the likelihood of pleading guilty); Leslie</w:t>
       </w:r>
       <w:r>
         <w:t xml:space="preserve"> </w:t>
@@ -11861,13 +11863,13 @@
         <w:t xml:space="preserve"> </w:t>
       </w:r>
       <w:r>
-        <w:t xml:space="preserve">VanNostrand &amp; Holsinger, The Hidden Costs of Pretrial Detention (Laura &amp; John Arnold Foundation, 2013) https://​​craftmediabucket.​s3.​amazonaws.​com/​​uploads/​​PDFs/​​LJAF_Report_hidden-​costs_FNL.​pdf, pp 19–20 (“Defendants detained pretrial were 1.3 times more likely to recidivate compared to defendants who were released at some point pending trial.”); Dobbie,</w:t>
-      </w:r>
-      <w:r>
-        <w:t xml:space="preserve"> </w:t>
-      </w:r>
-      <w:r>
-        <w:t xml:space="preserve">Goldin &amp; Yang, The Effects of Pretrial Detention on Conviction, Future Crime, and Employment: Evidence from Randomly Assigned Judges, 108 Am Econ Rev 201, 235 (2018), https://​​pubs.​aeaweb.​org/​​doi/​​pdfplus/​​10.​1257/​​aer.​20161503.</w:t>
+        <w:t xml:space="preserve">VanNostrand &amp; Holsinger, The Hidden Costs of Pretrial Detention (Laura &amp; John Arnold Foundation, 2013) https://​craftmediabucket.​s3.​amazonaws.​com/​uploads/​PDFs/​LJAF_Report_hidden-​costs_FNL.​pdf, pp 19–20 (“Defendants detained pretrial were 1.3 times more likely to recidivate compared to defendants who were released at some point pending trial.”); Dobbie,</w:t>
+      </w:r>
+      <w:r>
+        <w:t xml:space="preserve"> </w:t>
+      </w:r>
+      <w:r>
+        <w:t xml:space="preserve">Goldin &amp; Yang, The Effects of Pretrial Detention on Conviction, Future Crime, and Employment: Evidence from Randomly Assigned Judges, 108 Am Econ Rev 201, 235 (2018), https://​pubs.​aeaweb.​org/​doi/​pdfplus/​10.​1257/​aer.​20161503.</w:t>
       </w:r>
     </w:p>
   </w:footnote>
@@ -12808,6 +12810,15 @@
       <w:ind w:firstLine="0"/>
     </w:pPr>
   </w:style>
+  <w:style w:type="paragraph" w:customStyle="1" w:styleId="BodyTextKeep">
+    <w:name w:val="Body Text Keep"/>
+    <w:basedOn w:val="BodyText"/>
+    <w:qFormat/>
+    <w:pPr>
+      <w:keepNext/>
+      <w:keepLines/>
+    </w:pPr>
+  </w:style>
   <w:style w:type="paragraph" w:customStyle="1" w:styleId="XdList1">
     <w:name w:val="XdList 1"/>
     <w:basedOn w:val="Normal"/>
@@ -12860,6 +12871,33 @@
     <w:pPr>
       <w:spacing w:before="0" w:after="0" w:line="276" w:lineRule="exact"/>
       <w:ind w:left="2160" w:hanging="720"/>
+    </w:pPr>
+  </w:style>
+  <w:style w:type="paragraph" w:customStyle="1" w:styleId="XdQuoteList1">
+    <w:name w:val="Xd Quote List 1"/>
+    <w:basedOn w:val="Normal"/>
+    <w:qFormat/>
+    <w:pPr>
+      <w:spacing w:before="0" w:after="0" w:line="276" w:lineRule="exact"/>
+      <w:ind w:left="1440" w:right="720" w:hanging="720"/>
+    </w:pPr>
+  </w:style>
+  <w:style w:type="paragraph" w:customStyle="1" w:styleId="XdQuoteList2">
+    <w:name w:val="Xd Quote List 2"/>
+    <w:basedOn w:val="Normal"/>
+    <w:qFormat/>
+    <w:pPr>
+      <w:spacing w:before="0" w:after="0" w:line="276" w:lineRule="exact"/>
+      <w:ind w:left="2160" w:right="720" w:hanging="720"/>
+    </w:pPr>
+  </w:style>
+  <w:style w:type="paragraph" w:customStyle="1" w:styleId="XdQuoteList3">
+    <w:name w:val="Xd Quote List 3"/>
+    <w:basedOn w:val="Normal"/>
+    <w:qFormat/>
+    <w:pPr>
+      <w:spacing w:before="0" w:after="0" w:line="276" w:lineRule="exact"/>
+      <w:ind w:left="2880" w:right="720" w:hanging="720"/>
     </w:pPr>
   </w:style>
   <w:style w:type="paragraph" w:customStyle="1" w:styleId="SourceCode">

</xml_diff>